<commit_message>
Add math prototype and Gemini tutor integration
</commit_message>
<xml_diff>
--- a/docs/liste_taches.docx
+++ b/docs/liste_taches.docx
@@ -179,32 +179,44 @@
     </w:p>
     <w:p>
       <w:pPr>
-        <w:pStyle w:val="ListParagraph"/>
-        <w:numPr>
-          <w:ilvl w:val="0"/>
-          <w:numId w:val="2"/>
-        </w:numPr>
-        <w:spacing w:after="110" w:line="280"/>
-      </w:pPr>
-      <w:r>
-        <w:rPr>
-          <w:sz w:val="22"/>
-          <w:szCs w:val="22"/>
-        </w:rPr>
-        <w:t xml:space="preserve">Choisir la stack technique du prototype web (langage, framework)</w:t>
-      </w:r>
-    </w:p>
-    <w:p>
-      <w:pPr>
-        <w:pStyle w:val="ListParagraph"/>
-        <w:numPr>
-          <w:ilvl w:val="0"/>
-          <w:numId w:val="2"/>
-        </w:numPr>
-        <w:spacing w:after="110" w:line="280"/>
-      </w:pPr>
-      <w:r>
-        <w:rPr>
+        <w:spacing w:after="110" w:line="280"/>
+        <w:ind w:left="720" w:hanging="360"/>
+      </w:pPr>
+      <w:r>
+        <w:rPr>
+          <w:color w:val="2E7D32"/>
+          <w:sz w:val="22"/>
+          <w:szCs w:val="22"/>
+        </w:rPr>
+        <w:t xml:space="preserve">☑  </w:t>
+      </w:r>
+      <w:r>
+        <w:rPr>
+          <w:strike/>
+          <w:color w:val="808080"/>
+          <w:sz w:val="22"/>
+          <w:szCs w:val="22"/>
+        </w:rPr>
+        <w:t xml:space="preserve">Choisir la stack technique du prototype web : FastAPI + Gemini 2.5 Flash (tuteur IA) + JSON en fichiers, frontend HTML/JS vanilla</w:t>
+      </w:r>
+    </w:p>
+    <w:p>
+      <w:pPr>
+        <w:spacing w:after="110" w:line="280"/>
+        <w:ind w:left="720" w:hanging="360"/>
+      </w:pPr>
+      <w:r>
+        <w:rPr>
+          <w:color w:val="2E7D32"/>
+          <w:sz w:val="22"/>
+          <w:szCs w:val="22"/>
+        </w:rPr>
+        <w:t xml:space="preserve">☑  </w:t>
+      </w:r>
+      <w:r>
+        <w:rPr>
+          <w:strike/>
+          <w:color w:val="808080"/>
           <w:sz w:val="22"/>
           <w:szCs w:val="22"/>
         </w:rPr>
@@ -213,19 +225,42 @@
     </w:p>
     <w:p>
       <w:pPr>
-        <w:pStyle w:val="ListParagraph"/>
-        <w:numPr>
-          <w:ilvl w:val="0"/>
-          <w:numId w:val="2"/>
-        </w:numPr>
-        <w:spacing w:after="110" w:line="280"/>
-      </w:pPr>
-      <w:r>
-        <w:rPr>
+        <w:spacing w:after="110" w:line="280"/>
+        <w:ind w:left="720" w:hanging="360"/>
+      </w:pPr>
+      <w:r>
+        <w:rPr>
+          <w:color w:val="2E7D32"/>
+          <w:sz w:val="22"/>
+          <w:szCs w:val="22"/>
+        </w:rPr>
+        <w:t xml:space="preserve">☑  </w:t>
+      </w:r>
+      <w:r>
+        <w:rPr>
+          <w:strike/>
+          <w:color w:val="808080"/>
           <w:sz w:val="22"/>
           <w:szCs w:val="22"/>
         </w:rPr>
         <w:t xml:space="preserve">Générer les 3 variantes de présentation (guidé / semi-guidé / autonome) pour ce même échantillon</w:t>
+      </w:r>
+    </w:p>
+    <w:p>
+      <w:pPr>
+        <w:pStyle w:val="ListParagraph"/>
+        <w:numPr>
+          <w:ilvl w:val="0"/>
+          <w:numId w:val="2"/>
+        </w:numPr>
+        <w:spacing w:after="110" w:line="280"/>
+      </w:pPr>
+      <w:r>
+        <w:rPr>
+          <w:sz w:val="22"/>
+          <w:szCs w:val="22"/>
+        </w:rPr>
+        <w:t xml:space="preserve">Mettre en place le tuteur IA (chat d'aide ancré sur les etapes_methode, via l'API Gemini)</w:t>
       </w:r>
     </w:p>
     <w:p>

</xml_diff>

<commit_message>
Implement narrative Gemini generation and refresh project docs
</commit_message>
<xml_diff>
--- a/docs/liste_taches.docx
+++ b/docs/liste_taches.docx
@@ -248,15 +248,21 @@
     </w:p>
     <w:p>
       <w:pPr>
-        <w:pStyle w:val="ListParagraph"/>
-        <w:numPr>
-          <w:ilvl w:val="0"/>
-          <w:numId w:val="2"/>
-        </w:numPr>
-        <w:spacing w:after="110" w:line="280"/>
-      </w:pPr>
-      <w:r>
-        <w:rPr>
+        <w:spacing w:after="110" w:line="280"/>
+        <w:ind w:left="720" w:hanging="360"/>
+      </w:pPr>
+      <w:r>
+        <w:rPr>
+          <w:color w:val="2E7D32"/>
+          <w:sz w:val="22"/>
+          <w:szCs w:val="22"/>
+        </w:rPr>
+        <w:t xml:space="preserve">☑  </w:t>
+      </w:r>
+      <w:r>
+        <w:rPr>
+          <w:strike/>
+          <w:color w:val="808080"/>
           <w:sz w:val="22"/>
           <w:szCs w:val="22"/>
         </w:rPr>

</xml_diff>

<commit_message>
Add session tutor impact to mastery progression
</commit_message>
<xml_diff>
--- a/docs/liste_taches.docx
+++ b/docs/liste_taches.docx
@@ -306,15 +306,21 @@
     </w:p>
     <w:p>
       <w:pPr>
-        <w:pStyle w:val="ListParagraph"/>
-        <w:numPr>
-          <w:ilvl w:val="0"/>
-          <w:numId w:val="2"/>
-        </w:numPr>
-        <w:spacing w:after="110" w:line="280"/>
-      </w:pPr>
-      <w:r>
-        <w:rPr>
+        <w:spacing w:after="110" w:line="280"/>
+        <w:ind w:left="720" w:hanging="360"/>
+      </w:pPr>
+      <w:r>
+        <w:rPr>
+          <w:color w:val="2E7D32"/>
+          <w:sz w:val="22"/>
+          <w:szCs w:val="22"/>
+        </w:rPr>
+        <w:t xml:space="preserve">☑  </w:t>
+      </w:r>
+      <w:r>
+        <w:rPr>
+          <w:strike/>
+          <w:color w:val="808080"/>
           <w:sz w:val="22"/>
           <w:szCs w:val="22"/>
         </w:rPr>
@@ -323,15 +329,21 @@
     </w:p>
     <w:p>
       <w:pPr>
-        <w:pStyle w:val="ListParagraph"/>
-        <w:numPr>
-          <w:ilvl w:val="0"/>
-          <w:numId w:val="2"/>
-        </w:numPr>
-        <w:spacing w:after="110" w:line="280"/>
-      </w:pPr>
-      <w:r>
-        <w:rPr>
+        <w:spacing w:after="110" w:line="280"/>
+        <w:ind w:left="720" w:hanging="360"/>
+      </w:pPr>
+      <w:r>
+        <w:rPr>
+          <w:color w:val="2E7D32"/>
+          <w:sz w:val="22"/>
+          <w:szCs w:val="22"/>
+        </w:rPr>
+        <w:t xml:space="preserve">☑  </w:t>
+      </w:r>
+      <w:r>
+        <w:rPr>
+          <w:strike/>
+          <w:color w:val="808080"/>
           <w:sz w:val="22"/>
           <w:szCs w:val="22"/>
         </w:rPr>
@@ -340,15 +352,21 @@
     </w:p>
     <w:p>
       <w:pPr>
-        <w:pStyle w:val="ListParagraph"/>
-        <w:numPr>
-          <w:ilvl w:val="0"/>
-          <w:numId w:val="2"/>
-        </w:numPr>
-        <w:spacing w:after="110" w:line="280"/>
-      </w:pPr>
-      <w:r>
-        <w:rPr>
+        <w:spacing w:after="110" w:line="280"/>
+        <w:ind w:left="720" w:hanging="360"/>
+      </w:pPr>
+      <w:r>
+        <w:rPr>
+          <w:color w:val="2E7D32"/>
+          <w:sz w:val="22"/>
+          <w:szCs w:val="22"/>
+        </w:rPr>
+        <w:t xml:space="preserve">☑  </w:t>
+      </w:r>
+      <w:r>
+        <w:rPr>
+          <w:strike/>
+          <w:color w:val="808080"/>
           <w:sz w:val="22"/>
           <w:szCs w:val="22"/>
         </w:rPr>
@@ -373,15 +391,21 @@
     </w:p>
     <w:p>
       <w:pPr>
-        <w:pStyle w:val="ListParagraph"/>
-        <w:numPr>
-          <w:ilvl w:val="0"/>
-          <w:numId w:val="2"/>
-        </w:numPr>
-        <w:spacing w:after="110" w:line="280"/>
-      </w:pPr>
-      <w:r>
-        <w:rPr>
+        <w:spacing w:after="110" w:line="280"/>
+        <w:ind w:left="720" w:hanging="360"/>
+      </w:pPr>
+      <w:r>
+        <w:rPr>
+          <w:color w:val="2E7D32"/>
+          <w:sz w:val="22"/>
+          <w:szCs w:val="22"/>
+        </w:rPr>
+        <w:t xml:space="preserve">☑  </w:t>
+      </w:r>
+      <w:r>
+        <w:rPr>
+          <w:strike/>
+          <w:color w:val="808080"/>
           <w:sz w:val="22"/>
           <w:szCs w:val="22"/>
         </w:rPr>
@@ -390,15 +414,21 @@
     </w:p>
     <w:p>
       <w:pPr>
-        <w:pStyle w:val="ListParagraph"/>
-        <w:numPr>
-          <w:ilvl w:val="0"/>
-          <w:numId w:val="2"/>
-        </w:numPr>
-        <w:spacing w:after="110" w:line="280"/>
-      </w:pPr>
-      <w:r>
-        <w:rPr>
+        <w:spacing w:after="110" w:line="280"/>
+        <w:ind w:left="720" w:hanging="360"/>
+      </w:pPr>
+      <w:r>
+        <w:rPr>
+          <w:color w:val="2E7D32"/>
+          <w:sz w:val="22"/>
+          <w:szCs w:val="22"/>
+        </w:rPr>
+        <w:t xml:space="preserve">☑  </w:t>
+      </w:r>
+      <w:r>
+        <w:rPr>
+          <w:strike/>
+          <w:color w:val="808080"/>
           <w:sz w:val="22"/>
           <w:szCs w:val="22"/>
         </w:rPr>
@@ -407,15 +437,21 @@
     </w:p>
     <w:p>
       <w:pPr>
-        <w:pStyle w:val="ListParagraph"/>
-        <w:numPr>
-          <w:ilvl w:val="0"/>
-          <w:numId w:val="2"/>
-        </w:numPr>
-        <w:spacing w:after="110" w:line="280"/>
-      </w:pPr>
-      <w:r>
-        <w:rPr>
+        <w:spacing w:after="110" w:line="280"/>
+        <w:ind w:left="720" w:hanging="360"/>
+      </w:pPr>
+      <w:r>
+        <w:rPr>
+          <w:color w:val="2E7D32"/>
+          <w:sz w:val="22"/>
+          <w:szCs w:val="22"/>
+        </w:rPr>
+        <w:t xml:space="preserve">☑  </w:t>
+      </w:r>
+      <w:r>
+        <w:rPr>
+          <w:strike/>
+          <w:color w:val="808080"/>
           <w:sz w:val="22"/>
           <w:szCs w:val="22"/>
         </w:rPr>
@@ -424,15 +460,21 @@
     </w:p>
     <w:p>
       <w:pPr>
-        <w:pStyle w:val="ListParagraph"/>
-        <w:numPr>
-          <w:ilvl w:val="0"/>
-          <w:numId w:val="2"/>
-        </w:numPr>
-        <w:spacing w:after="110" w:line="280"/>
-      </w:pPr>
-      <w:r>
-        <w:rPr>
+        <w:spacing w:after="110" w:line="280"/>
+        <w:ind w:left="720" w:hanging="360"/>
+      </w:pPr>
+      <w:r>
+        <w:rPr>
+          <w:color w:val="2E7D32"/>
+          <w:sz w:val="22"/>
+          <w:szCs w:val="22"/>
+        </w:rPr>
+        <w:t xml:space="preserve">☑  </w:t>
+      </w:r>
+      <w:r>
+        <w:rPr>
+          <w:strike/>
+          <w:color w:val="808080"/>
           <w:sz w:val="22"/>
           <w:szCs w:val="22"/>
         </w:rPr>

</xml_diff>